<commit_message>
Mise à jour de l'image
</commit_message>
<xml_diff>
--- a/images/fichier-srce-img.docx
+++ b/images/fichier-srce-img.docx
@@ -27,7 +27,7 @@
         </w:rPr>
         <w:t xml:space="preserve"> accueil : </w:t>
       </w:r>
-      <w:hyperlink r:id="rId5" w:history="1">
+      <w:hyperlink r:id="rId5" w:anchor="uuid=d39b88e0-e1c1-4a85-9ed6-573fbb032d2b" w:history="1">
         <w:r>
           <w:rPr>
             <w:rStyle w:val="Hyperlien"/>
@@ -68,7 +68,7 @@
         </w:rPr>
         <w:t xml:space="preserve"> </w:t>
       </w:r>
-      <w:hyperlink r:id="rId6" w:history="1">
+      <w:hyperlink r:id="rId6" w:anchor="fromView=search&amp;page=1&amp;position=8&amp;uuid=5a426b8e-726a-404b-afa7-f418ca1c4fe3&amp;query=images+d%27acceuil+site+Voyage+canada" w:history="1">
         <w:r>
           <w:rPr>
             <w:rStyle w:val="Hyperlien"/>
@@ -193,234 +193,11 @@
         <w:rPr>
           <w:lang w:val="fr-CA"/>
         </w:rPr>
-        <w:t>Palettes  de couleur</w:t>
-      </w:r>
-    </w:p>
-    <w:tbl>
-      <w:tblPr>
-        <w:tblStyle w:val="Grilledutableau"/>
-        <w:tblW w:w="0" w:type="auto"/>
-        <w:tblLook w:val="04A0" w:firstRow="1" w:lastRow="0" w:firstColumn="1" w:lastColumn="0" w:noHBand="0" w:noVBand="1"/>
-      </w:tblPr>
-      <w:tblGrid>
-        <w:gridCol w:w="2972"/>
-        <w:gridCol w:w="1701"/>
-      </w:tblGrid>
-      <w:tr>
-        <w:tc>
-          <w:tcPr>
-            <w:tcW w:w="2972" w:type="dxa"/>
-          </w:tcPr>
-          <w:p>
-            <w:pPr>
-              <w:rPr>
-                <w:lang w:val="fr-CA"/>
-              </w:rPr>
-            </w:pPr>
-            <w:r>
-              <w:rPr>
-                <w:lang w:val="fr-CA"/>
-              </w:rPr>
-              <w:t>Blanc</w:t>
-            </w:r>
-          </w:p>
-        </w:tc>
-        <w:tc>
-          <w:tcPr>
-            <w:tcW w:w="1701" w:type="dxa"/>
-          </w:tcPr>
-          <w:p>
-            <w:pPr>
-              <w:rPr>
-                <w:lang w:val="fr-CA"/>
-              </w:rPr>
-            </w:pPr>
-            <w:r>
-              <w:rPr>
-                <w:lang w:val="fr-CA"/>
-              </w:rPr>
-              <w:t>#ffffff</w:t>
-            </w:r>
-          </w:p>
-        </w:tc>
-      </w:tr>
-      <w:tr>
-        <w:tc>
-          <w:tcPr>
-            <w:tcW w:w="2972" w:type="dxa"/>
-          </w:tcPr>
-          <w:p>
-            <w:pPr>
-              <w:rPr>
-                <w:lang w:val="fr-CA"/>
-              </w:rPr>
-            </w:pPr>
-            <w:r>
-              <w:rPr>
-                <w:lang w:val="fr-CA"/>
-              </w:rPr>
-              <w:t>Vert citron</w:t>
-            </w:r>
-          </w:p>
-        </w:tc>
-        <w:tc>
-          <w:tcPr>
-            <w:tcW w:w="1701" w:type="dxa"/>
-          </w:tcPr>
-          <w:p>
-            <w:pPr>
-              <w:rPr>
-                <w:lang w:val="fr-CA"/>
-              </w:rPr>
-            </w:pPr>
-            <w:r>
-              <w:rPr>
-                <w:lang w:val="fr-CA"/>
-              </w:rPr>
-              <w:t>#b6e612</w:t>
-            </w:r>
-          </w:p>
-        </w:tc>
-      </w:tr>
-      <w:tr>
-        <w:tc>
-          <w:tcPr>
-            <w:tcW w:w="2972" w:type="dxa"/>
-          </w:tcPr>
-          <w:p>
-            <w:pPr>
-              <w:rPr>
-                <w:lang w:val="fr-CA"/>
-              </w:rPr>
-            </w:pPr>
-            <w:proofErr w:type="gramStart"/>
-            <w:r>
-              <w:rPr>
-                <w:lang w:val="fr-CA"/>
-              </w:rPr>
-              <w:t>bleu</w:t>
-            </w:r>
-            <w:proofErr w:type="gramEnd"/>
-          </w:p>
-        </w:tc>
-        <w:tc>
-          <w:tcPr>
-            <w:tcW w:w="1701" w:type="dxa"/>
-          </w:tcPr>
-          <w:p>
-            <w:pPr>
-              <w:rPr>
-                <w:lang w:val="fr-CA"/>
-              </w:rPr>
-            </w:pPr>
-            <w:r>
-              <w:rPr>
-                <w:lang w:val="fr-CA"/>
-              </w:rPr>
-              <w:t>#2670f0</w:t>
-            </w:r>
-          </w:p>
-        </w:tc>
-      </w:tr>
-      <w:tr>
-        <w:tc>
-          <w:tcPr>
-            <w:tcW w:w="2972" w:type="dxa"/>
-          </w:tcPr>
-          <w:p>
-            <w:pPr>
-              <w:rPr>
-                <w:lang w:val="fr-CA"/>
-              </w:rPr>
-            </w:pPr>
-            <w:r>
-              <w:rPr>
-                <w:lang w:val="fr-CA"/>
-              </w:rPr>
-              <w:t>Bleu nuit</w:t>
-            </w:r>
-          </w:p>
-        </w:tc>
-        <w:tc>
-          <w:tcPr>
-            <w:tcW w:w="1701" w:type="dxa"/>
-          </w:tcPr>
-          <w:p>
-            <w:pPr>
-              <w:rPr>
-                <w:lang w:val="fr-CA"/>
-              </w:rPr>
-            </w:pPr>
-            <w:r>
-              <w:rPr>
-                <w:lang w:val="fr-CA"/>
-              </w:rPr>
-              <w:t>#6c9cda</w:t>
-            </w:r>
-          </w:p>
-        </w:tc>
-      </w:tr>
-      <w:tr>
-        <w:tc>
-          <w:tcPr>
-            <w:tcW w:w="2972" w:type="dxa"/>
-          </w:tcPr>
-          <w:p>
-            <w:pPr>
-              <w:rPr>
-                <w:lang w:val="fr-CA"/>
-              </w:rPr>
-            </w:pPr>
-            <w:r>
-              <w:rPr>
-                <w:lang w:val="fr-CA"/>
-              </w:rPr>
-              <w:t>Vert moutarde</w:t>
-            </w:r>
-          </w:p>
-        </w:tc>
-        <w:tc>
-          <w:tcPr>
-            <w:tcW w:w="1701" w:type="dxa"/>
-          </w:tcPr>
-          <w:p>
-            <w:pPr>
-              <w:rPr>
-                <w:lang w:val="fr-CA"/>
-              </w:rPr>
-            </w:pPr>
-            <w:r>
-              <w:rPr>
-                <w:lang w:val="fr-CA"/>
-              </w:rPr>
-              <w:t>#d1e7a1</w:t>
-            </w:r>
-          </w:p>
-        </w:tc>
-      </w:tr>
-    </w:tbl>
-    <w:p>
-      <w:pPr>
-        <w:rPr>
-          <w:lang w:val="fr-CA"/>
-        </w:rPr>
-      </w:pPr>
-    </w:p>
-    <w:p>
-      <w:pPr>
-        <w:rPr>
-          <w:lang w:val="fr-CA"/>
-        </w:rPr>
-      </w:pPr>
-      <w:r>
-        <w:rPr>
-          <w:lang w:val="fr-CA"/>
-        </w:rPr>
         <w:drawing>
-          <wp:inline distT="0" distB="0" distL="0" distR="0" wp14:anchorId="238390D8" wp14:editId="0FDC47E2">
-            <wp:extent cx="2432050" cy="1422400"/>
-            <wp:effectExtent l="0" t="0" r="6350" b="6350"/>
-            <wp:docPr id="703227010" name="Image 1"/>
+          <wp:inline distT="0" distB="0" distL="0" distR="0" wp14:anchorId="00C9115F" wp14:editId="4EDFA353">
+            <wp:extent cx="5981700" cy="2209800"/>
+            <wp:effectExtent l="0" t="0" r="0" b="0"/>
+            <wp:docPr id="2110218862" name="Image 1"/>
             <wp:cNvGraphicFramePr>
               <a:graphicFrameLocks xmlns:a="http://schemas.openxmlformats.org/drawingml/2006/main" noChangeAspect="1"/>
             </wp:cNvGraphicFramePr>
@@ -428,7 +205,7 @@
               <a:graphicData uri="http://schemas.openxmlformats.org/drawingml/2006/picture">
                 <pic:pic xmlns:pic="http://schemas.openxmlformats.org/drawingml/2006/picture">
                   <pic:nvPicPr>
-                    <pic:cNvPr id="703227010" name=""/>
+                    <pic:cNvPr id="2110218862" name=""/>
                     <pic:cNvPicPr/>
                   </pic:nvPicPr>
                   <pic:blipFill>
@@ -440,7 +217,61 @@
                   <pic:spPr>
                     <a:xfrm>
                       <a:off x="0" y="0"/>
-                      <a:ext cx="2432050" cy="1422400"/>
+                      <a:ext cx="5981700" cy="2209800"/>
+                    </a:xfrm>
+                    <a:prstGeom prst="rect">
+                      <a:avLst/>
+                    </a:prstGeom>
+                  </pic:spPr>
+                </pic:pic>
+              </a:graphicData>
+            </a:graphic>
+          </wp:inline>
+        </w:drawing>
+      </w:r>
+    </w:p>
+    <w:p>
+      <w:pPr>
+        <w:rPr>
+          <w:lang w:val="fr-CA"/>
+        </w:rPr>
+      </w:pPr>
+    </w:p>
+    <w:p>
+      <w:pPr>
+        <w:rPr>
+          <w:lang w:val="fr-CA"/>
+        </w:rPr>
+      </w:pPr>
+      <w:r>
+        <w:rPr>
+          <w:lang w:val="fr-CA"/>
+        </w:rPr>
+        <w:drawing>
+          <wp:inline distT="0" distB="0" distL="0" distR="0" wp14:anchorId="65A6EAF9" wp14:editId="7E551E02">
+            <wp:extent cx="5486400" cy="1240790"/>
+            <wp:effectExtent l="0" t="0" r="0" b="0"/>
+            <wp:docPr id="1564136271" name="Image 1"/>
+            <wp:cNvGraphicFramePr>
+              <a:graphicFrameLocks xmlns:a="http://schemas.openxmlformats.org/drawingml/2006/main" noChangeAspect="1"/>
+            </wp:cNvGraphicFramePr>
+            <a:graphic xmlns:a="http://schemas.openxmlformats.org/drawingml/2006/main">
+              <a:graphicData uri="http://schemas.openxmlformats.org/drawingml/2006/picture">
+                <pic:pic xmlns:pic="http://schemas.openxmlformats.org/drawingml/2006/picture">
+                  <pic:nvPicPr>
+                    <pic:cNvPr id="1564136271" name=""/>
+                    <pic:cNvPicPr/>
+                  </pic:nvPicPr>
+                  <pic:blipFill>
+                    <a:blip r:embed="rId9"/>
+                    <a:stretch>
+                      <a:fillRect/>
+                    </a:stretch>
+                  </pic:blipFill>
+                  <pic:spPr>
+                    <a:xfrm>
+                      <a:off x="0" y="0"/>
+                      <a:ext cx="5486400" cy="1240790"/>
                     </a:xfrm>
                     <a:prstGeom prst="rect">
                       <a:avLst/>

</xml_diff>